<commit_message>
added two sum hashmap; tc and sc
</commit_message>
<xml_diff>
--- a/DSA Roadmap for Tech Prep.docx
+++ b/DSA Roadmap for Tech Prep.docx
@@ -225,7 +225,7 @@
     <w:p>
       <w:r>
         <w:pict w14:anchorId="3EBD0768">
-          <v:rect id="_x0000_i1277" style="width:0;height:1.5pt" o:hralign="center" o:hrstd="t" o:hr="t" fillcolor="#a0a0a0" stroked="f"/>
+          <v:rect id="_x0000_i1025" style="width:0;height:1.5pt" o:hralign="center" o:hrstd="t" o:hr="t" fillcolor="#a0a0a0" stroked="f"/>
         </w:pict>
       </w:r>
     </w:p>
@@ -433,7 +433,7 @@
     <w:p>
       <w:r>
         <w:pict w14:anchorId="74D1F8BF">
-          <v:rect id="_x0000_i1278" style="width:0;height:1.5pt" o:hralign="center" o:hrstd="t" o:hr="t" fillcolor="#a0a0a0" stroked="f"/>
+          <v:rect id="_x0000_i1026" style="width:0;height:1.5pt" o:hralign="center" o:hrstd="t" o:hr="t" fillcolor="#a0a0a0" stroked="f"/>
         </w:pict>
       </w:r>
     </w:p>
@@ -531,7 +531,7 @@
     <w:p>
       <w:r>
         <w:pict w14:anchorId="36409AAB">
-          <v:rect id="_x0000_i1279" style="width:0;height:1.5pt" o:hralign="center" o:hrstd="t" o:hr="t" fillcolor="#a0a0a0" stroked="f"/>
+          <v:rect id="_x0000_i1027" style="width:0;height:1.5pt" o:hralign="center" o:hrstd="t" o:hr="t" fillcolor="#a0a0a0" stroked="f"/>
         </w:pict>
       </w:r>
     </w:p>
@@ -579,7 +579,7 @@
     <w:p>
       <w:r>
         <w:pict w14:anchorId="677A5F85">
-          <v:rect id="_x0000_i1280" style="width:0;height:1.5pt" o:hralign="center" o:hrstd="t" o:hr="t" fillcolor="#a0a0a0" stroked="f"/>
+          <v:rect id="_x0000_i1028" style="width:0;height:1.5pt" o:hralign="center" o:hrstd="t" o:hr="t" fillcolor="#a0a0a0" stroked="f"/>
         </w:pict>
       </w:r>
     </w:p>
@@ -632,7 +632,7 @@
     <w:p>
       <w:r>
         <w:pict w14:anchorId="5CAF6381">
-          <v:rect id="_x0000_i1281" style="width:0;height:1.5pt" o:hralign="center" o:hrstd="t" o:hr="t" fillcolor="#a0a0a0" stroked="f"/>
+          <v:rect id="_x0000_i1029" style="width:0;height:1.5pt" o:hralign="center" o:hrstd="t" o:hr="t" fillcolor="#a0a0a0" stroked="f"/>
         </w:pict>
       </w:r>
     </w:p>
@@ -688,7 +688,7 @@
     <w:p>
       <w:r>
         <w:pict w14:anchorId="4F89452C">
-          <v:rect id="_x0000_i1282" style="width:0;height:1.5pt" o:hralign="center" o:hrstd="t" o:hr="t" fillcolor="#a0a0a0" stroked="f"/>
+          <v:rect id="_x0000_i1030" style="width:0;height:1.5pt" o:hralign="center" o:hrstd="t" o:hr="t" fillcolor="#a0a0a0" stroked="f"/>
         </w:pict>
       </w:r>
     </w:p>
@@ -760,7 +760,7 @@
     <w:p>
       <w:r>
         <w:pict w14:anchorId="602F85BE">
-          <v:rect id="_x0000_i1283" style="width:0;height:1.5pt" o:hralign="center" o:hrstd="t" o:hr="t" fillcolor="#a0a0a0" stroked="f"/>
+          <v:rect id="_x0000_i1031" style="width:0;height:1.5pt" o:hralign="center" o:hrstd="t" o:hr="t" fillcolor="#a0a0a0" stroked="f"/>
         </w:pict>
       </w:r>
     </w:p>
@@ -851,7 +851,7 @@
       <w:r>
         <w:lastRenderedPageBreak/>
         <w:pict w14:anchorId="1A2AC548">
-          <v:rect id="_x0000_i1284" style="width:0;height:1.5pt" o:hralign="center" o:hrstd="t" o:hr="t" fillcolor="#a0a0a0" stroked="f"/>
+          <v:rect id="_x0000_i1032" style="width:0;height:1.5pt" o:hralign="center" o:hrstd="t" o:hr="t" fillcolor="#a0a0a0" stroked="f"/>
         </w:pict>
       </w:r>
     </w:p>
@@ -966,7 +966,7 @@
     <w:p>
       <w:r>
         <w:pict w14:anchorId="75DF2D46">
-          <v:rect id="_x0000_i1285" style="width:0;height:1.5pt" o:hralign="center" o:hrstd="t" o:hr="t" fillcolor="#a0a0a0" stroked="f"/>
+          <v:rect id="_x0000_i1033" style="width:0;height:1.5pt" o:hralign="center" o:hrstd="t" o:hr="t" fillcolor="#a0a0a0" stroked="f"/>
         </w:pict>
       </w:r>
     </w:p>
@@ -1061,7 +1061,7 @@
     <w:p>
       <w:r>
         <w:pict w14:anchorId="0DD8D9A2">
-          <v:rect id="_x0000_i1286" style="width:0;height:1.5pt" o:hralign="center" o:hrstd="t" o:hr="t" fillcolor="#a0a0a0" stroked="f"/>
+          <v:rect id="_x0000_i1034" style="width:0;height:1.5pt" o:hralign="center" o:hrstd="t" o:hr="t" fillcolor="#a0a0a0" stroked="f"/>
         </w:pict>
       </w:r>
     </w:p>
@@ -1150,7 +1150,7 @@
     <w:p>
       <w:r>
         <w:pict w14:anchorId="5321D16D">
-          <v:rect id="_x0000_i1287" style="width:0;height:1.5pt" o:hralign="center" o:hrstd="t" o:hr="t" fillcolor="#a0a0a0" stroked="f"/>
+          <v:rect id="_x0000_i1035" style="width:0;height:1.5pt" o:hralign="center" o:hrstd="t" o:hr="t" fillcolor="#a0a0a0" stroked="f"/>
         </w:pict>
       </w:r>
     </w:p>
@@ -1198,7 +1198,7 @@
     <w:p>
       <w:r>
         <w:pict w14:anchorId="536C1791">
-          <v:rect id="_x0000_i1288" style="width:0;height:1.5pt" o:hralign="center" o:hrstd="t" o:hr="t" fillcolor="#a0a0a0" stroked="f"/>
+          <v:rect id="_x0000_i1036" style="width:0;height:1.5pt" o:hralign="center" o:hrstd="t" o:hr="t" fillcolor="#a0a0a0" stroked="f"/>
         </w:pict>
       </w:r>
     </w:p>
@@ -1228,7 +1228,7 @@
     <w:p>
       <w:r>
         <w:pict w14:anchorId="74D0EEC3">
-          <v:rect id="_x0000_i1289" style="width:0;height:1.5pt" o:hralign="center" o:hrstd="t" o:hr="t" fillcolor="#a0a0a0" stroked="f"/>
+          <v:rect id="_x0000_i1037" style="width:0;height:1.5pt" o:hralign="center" o:hrstd="t" o:hr="t" fillcolor="#a0a0a0" stroked="f"/>
         </w:pict>
       </w:r>
     </w:p>
@@ -1295,7 +1295,7 @@
     <w:p>
       <w:r>
         <w:pict w14:anchorId="0E64ADEC">
-          <v:rect id="_x0000_i1290" style="width:0;height:1.5pt" o:hralign="center" o:hrstd="t" o:hr="t" fillcolor="#a0a0a0" stroked="f"/>
+          <v:rect id="_x0000_i1038" style="width:0;height:1.5pt" o:hralign="center" o:hrstd="t" o:hr="t" fillcolor="#a0a0a0" stroked="f"/>
         </w:pict>
       </w:r>
     </w:p>
@@ -1432,7 +1432,7 @@
     <w:p>
       <w:r>
         <w:pict w14:anchorId="4770EC9C">
-          <v:rect id="_x0000_i1291" style="width:0;height:1.5pt" o:hralign="center" o:hrstd="t" o:hr="t" fillcolor="#a0a0a0" stroked="f"/>
+          <v:rect id="_x0000_i1039" style="width:0;height:1.5pt" o:hralign="center" o:hrstd="t" o:hr="t" fillcolor="#a0a0a0" stroked="f"/>
         </w:pict>
       </w:r>
     </w:p>
@@ -1510,7 +1510,7 @@
     <w:p>
       <w:r>
         <w:pict w14:anchorId="5231E726">
-          <v:rect id="_x0000_i1368" style="width:0;height:1.5pt" o:hralign="center" o:hrstd="t" o:hr="t" fillcolor="#a0a0a0" stroked="f"/>
+          <v:rect id="_x0000_i1040" style="width:0;height:1.5pt" o:hralign="center" o:hrstd="t" o:hr="t" fillcolor="#a0a0a0" stroked="f"/>
         </w:pict>
       </w:r>
     </w:p>
@@ -1623,7 +1623,7 @@
     <w:p>
       <w:r>
         <w:pict w14:anchorId="5F7D8BC6">
-          <v:rect id="_x0000_i1293" style="width:0;height:1.5pt" o:hralign="center" o:hrstd="t" o:hr="t" fillcolor="#a0a0a0" stroked="f"/>
+          <v:rect id="_x0000_i1041" style="width:0;height:1.5pt" o:hralign="center" o:hrstd="t" o:hr="t" fillcolor="#a0a0a0" stroked="f"/>
         </w:pict>
       </w:r>
     </w:p>
@@ -1668,7 +1668,7 @@
     <w:p>
       <w:r>
         <w:pict w14:anchorId="6E680524">
-          <v:rect id="_x0000_i1294" style="width:0;height:1.5pt" o:hralign="center" o:hrstd="t" o:hr="t" fillcolor="#a0a0a0" stroked="f"/>
+          <v:rect id="_x0000_i1042" style="width:0;height:1.5pt" o:hralign="center" o:hrstd="t" o:hr="t" fillcolor="#a0a0a0" stroked="f"/>
         </w:pict>
       </w:r>
     </w:p>
@@ -1769,7 +1769,7 @@
       <w:r>
         <w:lastRenderedPageBreak/>
         <w:pict w14:anchorId="279A2A98">
-          <v:rect id="_x0000_i1295" style="width:0;height:1.5pt" o:hralign="center" o:hrstd="t" o:hr="t" fillcolor="#a0a0a0" stroked="f"/>
+          <v:rect id="_x0000_i1043" style="width:0;height:1.5pt" o:hralign="center" o:hrstd="t" o:hr="t" fillcolor="#a0a0a0" stroked="f"/>
         </w:pict>
       </w:r>
     </w:p>
@@ -1911,7 +1911,7 @@
     <w:p>
       <w:r>
         <w:pict w14:anchorId="6060CE14">
-          <v:rect id="_x0000_i1296" style="width:0;height:1.5pt" o:hralign="center" o:hrstd="t" o:hr="t" fillcolor="#a0a0a0" stroked="f"/>
+          <v:rect id="_x0000_i1044" style="width:0;height:1.5pt" o:hralign="center" o:hrstd="t" o:hr="t" fillcolor="#a0a0a0" stroked="f"/>
         </w:pict>
       </w:r>
     </w:p>
@@ -1959,7 +1959,7 @@
     <w:p>
       <w:r>
         <w:pict w14:anchorId="7CCEAC54">
-          <v:rect id="_x0000_i1297" style="width:0;height:1.5pt" o:hralign="center" o:hrstd="t" o:hr="t" fillcolor="#a0a0a0" stroked="f"/>
+          <v:rect id="_x0000_i1045" style="width:0;height:1.5pt" o:hralign="center" o:hrstd="t" o:hr="t" fillcolor="#a0a0a0" stroked="f"/>
         </w:pict>
       </w:r>
     </w:p>
@@ -1989,7 +1989,7 @@
     <w:p>
       <w:r>
         <w:pict w14:anchorId="1FB61545">
-          <v:rect id="_x0000_i1298" style="width:0;height:1.5pt" o:hralign="center" o:hrstd="t" o:hr="t" fillcolor="#a0a0a0" stroked="f"/>
+          <v:rect id="_x0000_i1046" style="width:0;height:1.5pt" o:hralign="center" o:hrstd="t" o:hr="t" fillcolor="#a0a0a0" stroked="f"/>
         </w:pict>
       </w:r>
     </w:p>
@@ -2112,7 +2112,7 @@
     <w:p>
       <w:r>
         <w:pict w14:anchorId="275AAA32">
-          <v:rect id="_x0000_i1299" style="width:0;height:1.5pt" o:hralign="center" o:hrstd="t" o:hr="t" fillcolor="#a0a0a0" stroked="f"/>
+          <v:rect id="_x0000_i1047" style="width:0;height:1.5pt" o:hralign="center" o:hrstd="t" o:hr="t" fillcolor="#a0a0a0" stroked="f"/>
         </w:pict>
       </w:r>
     </w:p>
@@ -2179,7 +2179,7 @@
     <w:p>
       <w:r>
         <w:pict w14:anchorId="5C40077F">
-          <v:rect id="_x0000_i1300" style="width:0;height:1.5pt" o:hralign="center" o:hrstd="t" o:hr="t" fillcolor="#a0a0a0" stroked="f"/>
+          <v:rect id="_x0000_i1048" style="width:0;height:1.5pt" o:hralign="center" o:hrstd="t" o:hr="t" fillcolor="#a0a0a0" stroked="f"/>
         </w:pict>
       </w:r>
     </w:p>
@@ -2298,7 +2298,7 @@
     <w:p>
       <w:r>
         <w:pict w14:anchorId="1F6C69FB">
-          <v:rect id="_x0000_i1372" style="width:0;height:1.5pt" o:hralign="center" o:hrstd="t" o:hr="t" fillcolor="#a0a0a0" stroked="f"/>
+          <v:rect id="_x0000_i1049" style="width:0;height:1.5pt" o:hralign="center" o:hrstd="t" o:hr="t" fillcolor="#a0a0a0" stroked="f"/>
         </w:pict>
       </w:r>
     </w:p>
@@ -2373,7 +2373,7 @@
     <w:p>
       <w:r>
         <w:pict w14:anchorId="1D2A89AB">
-          <v:rect id="_x0000_i1302" style="width:0;height:1.5pt" o:hralign="center" o:hrstd="t" o:hr="t" fillcolor="#a0a0a0" stroked="f"/>
+          <v:rect id="_x0000_i1050" style="width:0;height:1.5pt" o:hralign="center" o:hrstd="t" o:hr="t" fillcolor="#a0a0a0" stroked="f"/>
         </w:pict>
       </w:r>
     </w:p>
@@ -2429,7 +2429,7 @@
     <w:p>
       <w:r>
         <w:pict w14:anchorId="03F0238A">
-          <v:rect id="_x0000_i1303" style="width:0;height:1.5pt" o:hralign="center" o:hrstd="t" o:hr="t" fillcolor="#a0a0a0" stroked="f"/>
+          <v:rect id="_x0000_i1051" style="width:0;height:1.5pt" o:hralign="center" o:hrstd="t" o:hr="t" fillcolor="#a0a0a0" stroked="f"/>
         </w:pict>
       </w:r>
     </w:p>
@@ -2477,7 +2477,7 @@
     <w:p>
       <w:r>
         <w:pict w14:anchorId="2E902460">
-          <v:rect id="_x0000_i1304" style="width:0;height:1.5pt" o:hralign="center" o:hrstd="t" o:hr="t" fillcolor="#a0a0a0" stroked="f"/>
+          <v:rect id="_x0000_i1052" style="width:0;height:1.5pt" o:hralign="center" o:hrstd="t" o:hr="t" fillcolor="#a0a0a0" stroked="f"/>
         </w:pict>
       </w:r>
     </w:p>
@@ -2507,7 +2507,7 @@
     <w:p>
       <w:r>
         <w:pict w14:anchorId="6AD0360A">
-          <v:rect id="_x0000_i1305" style="width:0;height:1.5pt" o:hralign="center" o:hrstd="t" o:hr="t" fillcolor="#a0a0a0" stroked="f"/>
+          <v:rect id="_x0000_i1053" style="width:0;height:1.5pt" o:hralign="center" o:hrstd="t" o:hr="t" fillcolor="#a0a0a0" stroked="f"/>
         </w:pict>
       </w:r>
     </w:p>
@@ -2552,7 +2552,7 @@
     <w:p>
       <w:r>
         <w:pict w14:anchorId="50B5FC31">
-          <v:rect id="_x0000_i1306" style="width:0;height:1.5pt" o:hralign="center" o:hrstd="t" o:hr="t" fillcolor="#a0a0a0" stroked="f"/>
+          <v:rect id="_x0000_i1054" style="width:0;height:1.5pt" o:hralign="center" o:hrstd="t" o:hr="t" fillcolor="#a0a0a0" stroked="f"/>
         </w:pict>
       </w:r>
     </w:p>
@@ -2619,7 +2619,7 @@
     <w:p>
       <w:r>
         <w:pict w14:anchorId="7098C6A1">
-          <v:rect id="_x0000_i1307" style="width:0;height:1.5pt" o:hralign="center" o:hrstd="t" o:hr="t" fillcolor="#a0a0a0" stroked="f"/>
+          <v:rect id="_x0000_i1055" style="width:0;height:1.5pt" o:hralign="center" o:hrstd="t" o:hr="t" fillcolor="#a0a0a0" stroked="f"/>
         </w:pict>
       </w:r>
     </w:p>
@@ -2675,7 +2675,7 @@
     <w:p>
       <w:r>
         <w:pict w14:anchorId="3008FEBB">
-          <v:rect id="_x0000_i1308" style="width:0;height:1.5pt" o:hralign="center" o:hrstd="t" o:hr="t" fillcolor="#a0a0a0" stroked="f"/>
+          <v:rect id="_x0000_i1056" style="width:0;height:1.5pt" o:hralign="center" o:hrstd="t" o:hr="t" fillcolor="#a0a0a0" stroked="f"/>
         </w:pict>
       </w:r>
     </w:p>
@@ -2760,7 +2760,7 @@
     <w:p>
       <w:r>
         <w:pict w14:anchorId="642129AB">
-          <v:rect id="_x0000_i1309" style="width:0;height:1.5pt" o:hralign="center" o:hrstd="t" o:hr="t" fillcolor="#a0a0a0" stroked="f"/>
+          <v:rect id="_x0000_i1057" style="width:0;height:1.5pt" o:hralign="center" o:hrstd="t" o:hr="t" fillcolor="#a0a0a0" stroked="f"/>
         </w:pict>
       </w:r>
     </w:p>
@@ -2801,7 +2801,7 @@
     <w:p>
       <w:r>
         <w:pict w14:anchorId="674867E0">
-          <v:rect id="_x0000_i1310" style="width:0;height:1.5pt" o:hralign="center" o:hrstd="t" o:hr="t" fillcolor="#a0a0a0" stroked="f"/>
+          <v:rect id="_x0000_i1058" style="width:0;height:1.5pt" o:hralign="center" o:hrstd="t" o:hr="t" fillcolor="#a0a0a0" stroked="f"/>
         </w:pict>
       </w:r>
     </w:p>
@@ -2831,7 +2831,7 @@
     <w:p>
       <w:r>
         <w:pict w14:anchorId="5FC5E5A6">
-          <v:rect id="_x0000_i1311" style="width:0;height:1.5pt" o:hralign="center" o:hrstd="t" o:hr="t" fillcolor="#a0a0a0" stroked="f"/>
+          <v:rect id="_x0000_i1059" style="width:0;height:1.5pt" o:hralign="center" o:hrstd="t" o:hr="t" fillcolor="#a0a0a0" stroked="f"/>
         </w:pict>
       </w:r>
     </w:p>
@@ -2903,7 +2903,7 @@
     <w:p>
       <w:r>
         <w:pict w14:anchorId="4607F303">
-          <v:rect id="_x0000_i1312" style="width:0;height:1.5pt" o:hralign="center" o:hrstd="t" o:hr="t" fillcolor="#a0a0a0" stroked="f"/>
+          <v:rect id="_x0000_i1060" style="width:0;height:1.5pt" o:hralign="center" o:hrstd="t" o:hr="t" fillcolor="#a0a0a0" stroked="f"/>
         </w:pict>
       </w:r>
     </w:p>
@@ -3006,7 +3006,7 @@
     <w:p>
       <w:r>
         <w:pict w14:anchorId="3A028E89">
-          <v:rect id="_x0000_i1313" style="width:0;height:1.5pt" o:hralign="center" o:hrstd="t" o:hr="t" fillcolor="#a0a0a0" stroked="f"/>
+          <v:rect id="_x0000_i1061" style="width:0;height:1.5pt" o:hralign="center" o:hrstd="t" o:hr="t" fillcolor="#a0a0a0" stroked="f"/>
         </w:pict>
       </w:r>
     </w:p>
@@ -3054,7 +3054,7 @@
     <w:p>
       <w:r>
         <w:pict w14:anchorId="0F22EC73">
-          <v:rect id="_x0000_i1314" style="width:0;height:1.5pt" o:hralign="center" o:hrstd="t" o:hr="t" fillcolor="#a0a0a0" stroked="f"/>
+          <v:rect id="_x0000_i1062" style="width:0;height:1.5pt" o:hralign="center" o:hrstd="t" o:hr="t" fillcolor="#a0a0a0" stroked="f"/>
         </w:pict>
       </w:r>
     </w:p>
@@ -3084,7 +3084,7 @@
     <w:p>
       <w:r>
         <w:pict w14:anchorId="49D5A09D">
-          <v:rect id="_x0000_i1315" style="width:0;height:1.5pt" o:hralign="center" o:hrstd="t" o:hr="t" fillcolor="#a0a0a0" stroked="f"/>
+          <v:rect id="_x0000_i1063" style="width:0;height:1.5pt" o:hralign="center" o:hrstd="t" o:hr="t" fillcolor="#a0a0a0" stroked="f"/>
         </w:pict>
       </w:r>
     </w:p>
@@ -3151,7 +3151,7 @@
     <w:p>
       <w:r>
         <w:pict w14:anchorId="237F80A7">
-          <v:rect id="_x0000_i1316" style="width:0;height:1.5pt" o:hralign="center" o:hrstd="t" o:hr="t" fillcolor="#a0a0a0" stroked="f"/>
+          <v:rect id="_x0000_i1064" style="width:0;height:1.5pt" o:hralign="center" o:hrstd="t" o:hr="t" fillcolor="#a0a0a0" stroked="f"/>
         </w:pict>
       </w:r>
     </w:p>
@@ -3219,7 +3219,7 @@
     <w:p>
       <w:r>
         <w:pict w14:anchorId="6D77436F">
-          <v:rect id="_x0000_i1317" style="width:0;height:1.5pt" o:hralign="center" o:hrstd="t" o:hr="t" fillcolor="#a0a0a0" stroked="f"/>
+          <v:rect id="_x0000_i1065" style="width:0;height:1.5pt" o:hralign="center" o:hrstd="t" o:hr="t" fillcolor="#a0a0a0" stroked="f"/>
         </w:pict>
       </w:r>
     </w:p>
@@ -3264,7 +3264,7 @@
     <w:p>
       <w:r>
         <w:pict w14:anchorId="1362DF14">
-          <v:rect id="_x0000_i1318" style="width:0;height:1.5pt" o:hralign="center" o:hrstd="t" o:hr="t" fillcolor="#a0a0a0" stroked="f"/>
+          <v:rect id="_x0000_i1066" style="width:0;height:1.5pt" o:hralign="center" o:hrstd="t" o:hr="t" fillcolor="#a0a0a0" stroked="f"/>
         </w:pict>
       </w:r>
     </w:p>
@@ -3516,7 +3516,7 @@
         </w:tc>
         <w:tc>
           <w:tcPr>
-            <w:tcW w:w="0" w:type="auto"/>
+            <w:tcW w:w="1001" w:type="dxa"/>
             <w:vAlign w:val="center"/>
             <w:hideMark/>
           </w:tcPr>
@@ -3555,7 +3555,7 @@
         </w:tc>
         <w:tc>
           <w:tcPr>
-            <w:tcW w:w="0" w:type="auto"/>
+            <w:tcW w:w="1001" w:type="dxa"/>
             <w:vAlign w:val="center"/>
             <w:hideMark/>
           </w:tcPr>
@@ -3587,7 +3587,7 @@
         </w:tc>
         <w:tc>
           <w:tcPr>
-            <w:tcW w:w="0" w:type="auto"/>
+            <w:tcW w:w="1001" w:type="dxa"/>
             <w:vAlign w:val="center"/>
             <w:hideMark/>
           </w:tcPr>
@@ -3619,7 +3619,7 @@
         </w:tc>
         <w:tc>
           <w:tcPr>
-            <w:tcW w:w="0" w:type="auto"/>
+            <w:tcW w:w="1001" w:type="dxa"/>
             <w:vAlign w:val="center"/>
             <w:hideMark/>
           </w:tcPr>
@@ -3651,7 +3651,7 @@
         </w:tc>
         <w:tc>
           <w:tcPr>
-            <w:tcW w:w="0" w:type="auto"/>
+            <w:tcW w:w="1001" w:type="dxa"/>
             <w:vAlign w:val="center"/>
             <w:hideMark/>
           </w:tcPr>
@@ -3683,7 +3683,7 @@
         </w:tc>
         <w:tc>
           <w:tcPr>
-            <w:tcW w:w="0" w:type="auto"/>
+            <w:tcW w:w="1001" w:type="dxa"/>
             <w:vAlign w:val="center"/>
             <w:hideMark/>
           </w:tcPr>
@@ -3715,7 +3715,7 @@
         </w:tc>
         <w:tc>
           <w:tcPr>
-            <w:tcW w:w="0" w:type="auto"/>
+            <w:tcW w:w="1001" w:type="dxa"/>
             <w:vAlign w:val="center"/>
             <w:hideMark/>
           </w:tcPr>
@@ -3751,7 +3751,7 @@
         </w:tc>
         <w:tc>
           <w:tcPr>
-            <w:tcW w:w="0" w:type="auto"/>
+            <w:tcW w:w="1001" w:type="dxa"/>
             <w:vAlign w:val="center"/>
             <w:hideMark/>
           </w:tcPr>
@@ -3783,7 +3783,7 @@
         </w:tc>
         <w:tc>
           <w:tcPr>
-            <w:tcW w:w="0" w:type="auto"/>
+            <w:tcW w:w="1001" w:type="dxa"/>
             <w:vAlign w:val="center"/>
             <w:hideMark/>
           </w:tcPr>
@@ -3815,7 +3815,7 @@
         </w:tc>
         <w:tc>
           <w:tcPr>
-            <w:tcW w:w="0" w:type="auto"/>
+            <w:tcW w:w="1001" w:type="dxa"/>
             <w:vAlign w:val="center"/>
             <w:hideMark/>
           </w:tcPr>
@@ -3847,7 +3847,7 @@
         </w:tc>
         <w:tc>
           <w:tcPr>
-            <w:tcW w:w="0" w:type="auto"/>
+            <w:tcW w:w="1001" w:type="dxa"/>
             <w:vAlign w:val="center"/>
             <w:hideMark/>
           </w:tcPr>
@@ -3879,7 +3879,7 @@
         </w:tc>
         <w:tc>
           <w:tcPr>
-            <w:tcW w:w="0" w:type="auto"/>
+            <w:tcW w:w="1001" w:type="dxa"/>
             <w:vAlign w:val="center"/>
             <w:hideMark/>
           </w:tcPr>
@@ -3911,7 +3911,7 @@
         </w:tc>
         <w:tc>
           <w:tcPr>
-            <w:tcW w:w="0" w:type="auto"/>
+            <w:tcW w:w="1001" w:type="dxa"/>
             <w:vAlign w:val="center"/>
             <w:hideMark/>
           </w:tcPr>
@@ -3943,7 +3943,7 @@
         </w:tc>
         <w:tc>
           <w:tcPr>
-            <w:tcW w:w="0" w:type="auto"/>
+            <w:tcW w:w="1001" w:type="dxa"/>
             <w:vAlign w:val="center"/>
             <w:hideMark/>
           </w:tcPr>
@@ -3975,7 +3975,7 @@
         </w:tc>
         <w:tc>
           <w:tcPr>
-            <w:tcW w:w="0" w:type="auto"/>
+            <w:tcW w:w="1001" w:type="dxa"/>
             <w:vAlign w:val="center"/>
             <w:hideMark/>
           </w:tcPr>
@@ -4007,7 +4007,7 @@
         </w:tc>
         <w:tc>
           <w:tcPr>
-            <w:tcW w:w="0" w:type="auto"/>
+            <w:tcW w:w="1001" w:type="dxa"/>
             <w:vAlign w:val="center"/>
             <w:hideMark/>
           </w:tcPr>
@@ -4039,7 +4039,7 @@
         </w:tc>
         <w:tc>
           <w:tcPr>
-            <w:tcW w:w="0" w:type="auto"/>
+            <w:tcW w:w="1001" w:type="dxa"/>
             <w:vAlign w:val="center"/>
             <w:hideMark/>
           </w:tcPr>
@@ -4071,7 +4071,7 @@
         </w:tc>
         <w:tc>
           <w:tcPr>
-            <w:tcW w:w="0" w:type="auto"/>
+            <w:tcW w:w="1001" w:type="dxa"/>
             <w:vAlign w:val="center"/>
             <w:hideMark/>
           </w:tcPr>
@@ -4103,7 +4103,7 @@
         </w:tc>
         <w:tc>
           <w:tcPr>
-            <w:tcW w:w="0" w:type="auto"/>
+            <w:tcW w:w="1001" w:type="dxa"/>
             <w:vAlign w:val="center"/>
             <w:hideMark/>
           </w:tcPr>
@@ -4135,7 +4135,7 @@
         </w:tc>
         <w:tc>
           <w:tcPr>
-            <w:tcW w:w="0" w:type="auto"/>
+            <w:tcW w:w="1001" w:type="dxa"/>
             <w:vAlign w:val="center"/>
             <w:hideMark/>
           </w:tcPr>
@@ -9746,6 +9746,7 @@
   <w:style w:type="character" w:default="1" w:styleId="DefaultParagraphFont">
     <w:name w:val="Default Paragraph Font"/>
     <w:uiPriority w:val="1"/>
+    <w:semiHidden/>
     <w:unhideWhenUsed/>
   </w:style>
   <w:style w:type="table" w:default="1" w:styleId="TableNormal">

</xml_diff>